<commit_message>
Atualização do relatório final
</commit_message>
<xml_diff>
--- a/relatorio_final.docx
+++ b/relatorio_final.docx
@@ -6551,6 +6551,13 @@
         <w:spacing w:after="0" w:line="276" w:lineRule="auto"/>
         <w:ind w:left="708"/>
         <w:jc w:val="both"/>
+        <w:rPr>
+          <w:rFonts w:ascii="Calibri" w:hAnsi="Calibri" w:eastAsia="Calibri" w:cs="Calibri"/>
+          <w:noProof w:val="0"/>
+          <w:sz w:val="24"/>
+          <w:szCs w:val="24"/>
+          <w:lang w:val="pt-BR"/>
+        </w:rPr>
       </w:pPr>
       <w:r>
         <w:rPr>
@@ -6561,6 +6568,49 @@
           <w:lang w:val="pt-BR"/>
         </w:rPr>
         <w:t>O projeto atingiu os objetivos propostos e contribuiu para uma melhor organização das informações do estúdio de tatuagem. Como possibilidade para trabalhos futuros, poderiam ser desenvolvidos painéis interativos, sistemas de acompanhamento de clientes ou ferramentas para análise automática dos dados.</w:t>
+      </w:r>
+      <w:r>
+        <w:drawing>
+          <wp:inline wp14:editId="05D1ABB7" wp14:anchorId="29B1112E">
+            <wp:extent cx="5724525" cy="4295775"/>
+            <wp:effectExtent l="0" t="0" r="0" b="0"/>
+            <wp:docPr id="1371228265" name="drawing"/>
+            <wp:cNvGraphicFramePr>
+              <a:graphicFrameLocks noChangeAspect="1"/>
+            </wp:cNvGraphicFramePr>
+            <a:graphic>
+              <a:graphicData xmlns:a="http://schemas.openxmlformats.org/drawingml/2006/main" uri="http://schemas.openxmlformats.org/drawingml/2006/picture">
+                <pic:pic xmlns:pic="http://schemas.openxmlformats.org/drawingml/2006/picture">
+                  <pic:nvPicPr>
+                    <pic:cNvPr id="1371228265" name="Picture 1371228265"/>
+                    <pic:cNvPicPr/>
+                  </pic:nvPicPr>
+                  <pic:blipFill>
+                    <a:blip xmlns:r="http://schemas.openxmlformats.org/officeDocument/2006/relationships" r:embed="rId794663441">
+                      <a:extLst>
+                        <a:ext uri="{28A0092B-C50C-407E-A947-70E740481C1C}">
+                          <a14:useLocalDpi xmlns:a14="http://schemas.microsoft.com/office/drawing/2010/main"/>
+                        </a:ext>
+                      </a:extLst>
+                    </a:blip>
+                    <a:stretch>
+                      <a:fillRect/>
+                    </a:stretch>
+                  </pic:blipFill>
+                  <pic:spPr>
+                    <a:xfrm>
+                      <a:off x="0" y="0"/>
+                      <a:ext cx="5724525" cy="4295775"/>
+                    </a:xfrm>
+                    <a:prstGeom prst="rect">
+                      <a:avLst/>
+                    </a:prstGeom>
+                  </pic:spPr>
+                </pic:pic>
+              </a:graphicData>
+            </a:graphic>
+          </wp:inline>
+        </w:drawing>
       </w:r>
     </w:p>
     <w:sectPr>

</xml_diff>